<commit_message>
Việc 55058: đọc/ghi HIS_ICD.IS_CHRONIC qua PropertyInfo để build được với MOS.EFMODEL hiện tại
Không tham chiếu trực tiếp IS_CHRONIC -> người khác build từ Develop với lib/MOS/MOS.EFMODEL.dll
chưa có cột vẫn không lỗi CS1061; runtime chưa có cột thì tự ẩn ô/cột (HisIcd) và bỏ qua cảnh báo
(ExamServiceReqExecute).

Co-Authored-By: Claude Opus 5.5 <noreply@anthropic.com>
</commit_message>
<xml_diff>
--- a/docs/55058_B_KyThuat_CanhBaoIcdManTinh_KetThucDieuTri.docx
+++ b/docs/55058_B_KyThuat_CanhBaoIcdManTinh_KetThucDieuTri.docx
@@ -6189,15 +6189,26 @@
           <w:p>
             <w:r/>
             <w:r>
-              <w:t xml:space="preserve">Thêm cơ chế tự ẩn ô + cột khi EFMODEL runtime chưa có </w:t>
-            </w:r>
-            <w:r>
               <w:rPr>
                 <w:rFonts w:ascii="Consolas" w:hAnsi="Consolas"/>
                 <w:color w:val="A31515"/>
                 <w:sz w:val="19"/>
               </w:rPr>
               <w:t>IS_CHRONIC</w:t>
+            </w:r>
+            <w:r>
+              <w:t xml:space="preserve"> đọc/ghi qua </w:t>
+            </w:r>
+            <w:r>
+              <w:rPr>
+                <w:rFonts w:ascii="Consolas" w:hAnsi="Consolas"/>
+                <w:color w:val="A31515"/>
+                <w:sz w:val="19"/>
+              </w:rPr>
+              <w:t>PropertyInfo</w:t>
+            </w:r>
+            <w:r>
+              <w:t xml:space="preserve"> cache; tự ẩn ô + cột khi EFMODEL runtime chưa có cột</w:t>
             </w:r>
           </w:p>
         </w:tc>
@@ -6335,7 +6346,15 @@
           <w:p>
             <w:r/>
             <w:r>
-              <w:t xml:space="preserve">Truy cập </w:t>
+              <w:rPr>
+                <w:rFonts w:ascii="Consolas" w:hAnsi="Consolas"/>
+                <w:color w:val="A31515"/>
+                <w:sz w:val="19"/>
+              </w:rPr>
+              <w:t>FindChronicIcd</w:t>
+            </w:r>
+            <w:r>
+              <w:t xml:space="preserve"> tìm theo mã rồi đọc </w:t>
             </w:r>
             <w:r>
               <w:rPr>
@@ -6354,21 +6373,10 @@
                 <w:color w:val="A31515"/>
                 <w:sz w:val="19"/>
               </w:rPr>
-              <w:t>FindChronicIcd</w:t>
-            </w:r>
-            <w:r>
-              <w:t xml:space="preserve"> (</w:t>
-            </w:r>
-            <w:r>
-              <w:rPr>
-                <w:rFonts w:ascii="Consolas" w:hAnsi="Consolas"/>
-                <w:color w:val="A31515"/>
-                <w:sz w:val="19"/>
-              </w:rPr>
-              <w:t>NoInlining</w:t>
-            </w:r>
-            <w:r>
-              <w:t>) + kiểm tra reflection → EFMODEL cũ thì bỏ qua cảnh báo</w:t>
+              <w:t>PropertyInfo</w:t>
+            </w:r>
+            <w:r>
+              <w:t xml:space="preserve"> → EFMODEL cũ thì bỏ qua cảnh báo</w:t>
             </w:r>
           </w:p>
         </w:tc>
@@ -6392,29 +6400,16 @@
           <w:p>
             <w:r/>
             <w:r>
-              <w:t xml:space="preserve">3 project build v4.5 AnyCPU, 0 lỗi, biên dịch với EFMODEL mới qua </w:t>
+              <w:t xml:space="preserve">3 project build v4.5 AnyCPU, 0 lỗi </w:t>
             </w:r>
             <w:r>
               <w:rPr>
-                <w:rFonts w:ascii="Consolas" w:hAnsi="Consolas"/>
-                <w:color w:val="A31515"/>
-                <w:sz w:val="19"/>
+                <w:b/>
               </w:rPr>
-              <w:t>ReferencePath</w:t>
-            </w:r>
-            <w:r>
-              <w:t xml:space="preserve"> shim (không đè </w:t>
-            </w:r>
-            <w:r>
-              <w:rPr>
-                <w:rFonts w:ascii="Consolas" w:hAnsi="Consolas"/>
-                <w:color w:val="A31515"/>
-                <w:sz w:val="19"/>
-              </w:rPr>
-              <w:t>lib/MOS</w:t>
-            </w:r>
-            <w:r>
-              <w:t>)</w:t>
+              <w:t>với `lib/MOS/MOS.EFMODEL.dll` hiện tại</w:t>
+            </w:r>
+            <w:r>
+              <w:t xml:space="preserve"> (không cần EFMODEL mới để biên dịch)</w:t>
             </w:r>
           </w:p>
         </w:tc>
@@ -6425,7 +6420,18 @@
           <w:p>
             <w:r/>
             <w:r>
-              <w:t>—</w:t>
+              <w:t xml:space="preserve">Không tham chiếu trực tiếp </w:t>
+            </w:r>
+            <w:r>
+              <w:rPr>
+                <w:rFonts w:ascii="Consolas" w:hAnsi="Consolas"/>
+                <w:color w:val="A31515"/>
+                <w:sz w:val="19"/>
+              </w:rPr>
+              <w:t>IS_CHRONIC</w:t>
+            </w:r>
+            <w:r>
+              <w:t xml:space="preserve"> để không làm gãy build của người khác từ Develop</w:t>
             </w:r>
           </w:p>
         </w:tc>

</xml_diff>